<commit_message>
TNDY 315: regenerate speaker script from the deck's own notes
The script is now built by src/script_from_pptx.js, which reads the
speaker notes and slide titles straight from the .pptx, so slide numbers
cannot drift from the deck. 18 slides: Doron 1-5 and 16-17, Manuel 6-10,
Amit 11-15, slide 18 not presented.

Co-Authored-By: Claude Opus 5.5 <noreply@anthropic.com>
Claude-Session: https://claude.ai/code/session_01YVZmjnqcf32hU9jiQo49qi
</commit_message>
<xml_diff>
--- a/docs/coursework/TNDY315/final-project/SOLANGE_Speaker_Script.docx
+++ b/docs/coursework/TNDY315/final-project/SOLANGE_Speaker_Script.docx
@@ -20,7 +20,7 @@
     </w:p>
     <w:p>
       <w:pPr>
-        <w:spacing w:after="300"/>
+        <w:spacing w:after="80"/>
         <w:jc w:val="center"/>
       </w:pPr>
       <w:r>
@@ -36,6 +36,23 @@
     </w:p>
     <w:p>
       <w:pPr>
+        <w:spacing w:after="300"/>
+        <w:jc w:val="center"/>
+      </w:pPr>
+      <w:r>
+        <w:rPr>
+          <w:rFonts w:ascii="Calibri" w:cs="Calibri" w:eastAsia="Calibri" w:hAnsi="Calibri"/>
+          <w:i/>
+          <w:iCs/>
+          <w:color w:val="6B7785"/>
+          <w:sz w:val="18"/>
+          <w:szCs w:val="18"/>
+        </w:rPr>
+        <w:t xml:space="preserve">Generated directly from the speaker notes inside the PowerPoint file, so every slide number matches the deck.</w:t>
+      </w:r>
+    </w:p>
+    <w:p>
+      <w:pPr>
         <w:keepNext/>
         <w:spacing w:after="80" w:before="280"/>
       </w:pPr>
@@ -48,7 +65,7 @@
           <w:sz w:val="26"/>
           <w:szCs w:val="26"/>
         </w:rPr>
-        <w:t xml:space="preserve">Slide 1: Title</w:t>
+        <w:t xml:space="preserve">Slide 1: Title: SOLANGE</w:t>
       </w:r>
     </w:p>
     <w:p>
@@ -783,7 +800,7 @@
           <w:sz w:val="26"/>
           <w:szCs w:val="26"/>
         </w:rPr>
-        <w:t xml:space="preserve">Slide 10: Project timeline</w:t>
+        <w:t xml:space="preserve">Slide 10: Project timeline: March 2026 to February 2028</w:t>
       </w:r>
     </w:p>
     <w:p>
@@ -1442,6 +1459,40 @@
           <w:szCs w:val="22"/>
         </w:rPr>
         <w:t xml:space="preserve">Thank you for listening. On behalf of Manuel, Amit, and myself, we are happy to take your questions.</w:t>
+      </w:r>
+    </w:p>
+    <w:p>
+      <w:pPr>
+        <w:keepNext/>
+        <w:spacing w:after="80" w:before="280"/>
+      </w:pPr>
+      <w:r>
+        <w:rPr>
+          <w:rFonts w:ascii="Calibri" w:cs="Calibri" w:eastAsia="Calibri" w:hAnsi="Calibri"/>
+          <w:b/>
+          <w:bCs/>
+          <w:color w:val="1B2A41"/>
+          <w:sz w:val="26"/>
+          <w:szCs w:val="26"/>
+        </w:rPr>
+        <w:t xml:space="preserve">Slide 18: References</w:t>
+      </w:r>
+    </w:p>
+    <w:p>
+      <w:pPr>
+        <w:keepNext/>
+        <w:spacing w:after="100"/>
+      </w:pPr>
+      <w:r>
+        <w:rPr>
+          <w:rFonts w:ascii="Calibri" w:cs="Calibri" w:eastAsia="Calibri" w:hAnsi="Calibri"/>
+          <w:b/>
+          <w:bCs/>
+          <w:color w:val="B8441F"/>
+          <w:sz w:val="21"/>
+          <w:szCs w:val="21"/>
+        </w:rPr>
+        <w:t xml:space="preserve">NOT PRESENTED</w:t>
       </w:r>
     </w:p>
     <w:sectPr>

</xml_diff>